<commit_message>
listar cliente, orden, repuestos // verificar cliente
</commit_message>
<xml_diff>
--- a/3_SISTEMA/ECU_C2_Verificar_Cliente.docx
+++ b/3_SISTEMA/ECU_C2_Verificar_Cliente.docx
@@ -1140,6 +1140,14 @@
         </w:rPr>
         <w:t xml:space="preserve"> </w:t>
       </w:r>
+      <w:r>
+        <w:rPr>
+          <w:rFonts w:ascii="Arial" w:hAnsi="Arial" w:cs="Arial"/>
+          <w:sz w:val="24"/>
+          <w:szCs w:val="24"/>
+        </w:rPr>
+        <w:t xml:space="preserve">se </w:t>
+      </w:r>
       <w:proofErr w:type="spellStart"/>
       <w:r>
         <w:rPr>
@@ -1147,7 +1155,7 @@
           <w:sz w:val="24"/>
           <w:szCs w:val="24"/>
         </w:rPr>
-        <w:t>verifica</w:t>
+        <w:t>encuentra</w:t>
       </w:r>
       <w:proofErr w:type="spellEnd"/>
       <w:r>
@@ -1156,7 +1164,7 @@
           <w:sz w:val="24"/>
           <w:szCs w:val="24"/>
         </w:rPr>
-        <w:t xml:space="preserve"> al </w:t>
+        <w:t xml:space="preserve"> </w:t>
       </w:r>
       <w:proofErr w:type="spellStart"/>
       <w:r>
@@ -1165,7 +1173,7 @@
           <w:sz w:val="24"/>
           <w:szCs w:val="24"/>
         </w:rPr>
-        <w:t>cliente</w:t>
+        <w:t>en</w:t>
       </w:r>
       <w:proofErr w:type="spellEnd"/>
       <w:r>
@@ -1174,8 +1182,54 @@
           <w:sz w:val="24"/>
           <w:szCs w:val="24"/>
         </w:rPr>
-        <w:t xml:space="preserve">. </w:t>
-      </w:r>
+        <w:t xml:space="preserve"> la </w:t>
+      </w:r>
+      <w:proofErr w:type="spellStart"/>
+      <w:r>
+        <w:rPr>
+          <w:rFonts w:ascii="Arial" w:hAnsi="Arial" w:cs="Arial"/>
+          <w:sz w:val="24"/>
+          <w:szCs w:val="24"/>
+        </w:rPr>
+        <w:t>interfaz</w:t>
+      </w:r>
+      <w:proofErr w:type="spellEnd"/>
+      <w:r>
+        <w:rPr>
+          <w:rFonts w:ascii="Arial" w:hAnsi="Arial" w:cs="Arial"/>
+          <w:sz w:val="24"/>
+          <w:szCs w:val="24"/>
+        </w:rPr>
+        <w:t xml:space="preserve"> </w:t>
+      </w:r>
+      <w:proofErr w:type="spellStart"/>
+      <w:r>
+        <w:rPr>
+          <w:rFonts w:ascii="Arial" w:hAnsi="Arial" w:cs="Arial"/>
+          <w:sz w:val="24"/>
+          <w:szCs w:val="24"/>
+        </w:rPr>
+        <w:t>Listar</w:t>
+      </w:r>
+      <w:proofErr w:type="spellEnd"/>
+      <w:r>
+        <w:rPr>
+          <w:rFonts w:ascii="Arial" w:hAnsi="Arial" w:cs="Arial"/>
+          <w:sz w:val="24"/>
+          <w:szCs w:val="24"/>
+        </w:rPr>
+        <w:t xml:space="preserve"> </w:t>
+      </w:r>
+      <w:proofErr w:type="spellStart"/>
+      <w:r>
+        <w:rPr>
+          <w:rFonts w:ascii="Arial" w:hAnsi="Arial" w:cs="Arial"/>
+          <w:sz w:val="24"/>
+          <w:szCs w:val="24"/>
+        </w:rPr>
+        <w:t>Cliente</w:t>
+      </w:r>
+      <w:proofErr w:type="spellEnd"/>
     </w:p>
     <w:p>
       <w:pPr>
@@ -1224,7 +1278,7 @@
           <w:sz w:val="24"/>
           <w:szCs w:val="24"/>
         </w:rPr>
-        <w:t>modifica</w:t>
+        <w:t>selecciona</w:t>
       </w:r>
       <w:proofErr w:type="spellEnd"/>
       <w:r>
@@ -1233,7 +1287,7 @@
           <w:sz w:val="24"/>
           <w:szCs w:val="24"/>
         </w:rPr>
-        <w:t xml:space="preserve"> al </w:t>
+        <w:t xml:space="preserve"> </w:t>
       </w:r>
       <w:proofErr w:type="spellStart"/>
       <w:r>
@@ -1242,6 +1296,24 @@
           <w:sz w:val="24"/>
           <w:szCs w:val="24"/>
         </w:rPr>
+        <w:t>actualizar</w:t>
+      </w:r>
+      <w:proofErr w:type="spellEnd"/>
+      <w:r>
+        <w:rPr>
+          <w:rFonts w:ascii="Arial" w:hAnsi="Arial" w:cs="Arial"/>
+          <w:sz w:val="24"/>
+          <w:szCs w:val="24"/>
+        </w:rPr>
+        <w:t xml:space="preserve"> </w:t>
+      </w:r>
+      <w:proofErr w:type="spellStart"/>
+      <w:r>
+        <w:rPr>
+          <w:rFonts w:ascii="Arial" w:hAnsi="Arial" w:cs="Arial"/>
+          <w:sz w:val="24"/>
+          <w:szCs w:val="24"/>
+        </w:rPr>
         <w:t>cliente</w:t>
       </w:r>
       <w:proofErr w:type="spellEnd"/>
@@ -1251,7 +1323,7 @@
           <w:sz w:val="24"/>
           <w:szCs w:val="24"/>
         </w:rPr>
-        <w:t xml:space="preserve">. </w:t>
+        <w:t>.</w:t>
       </w:r>
     </w:p>
     <w:p>
@@ -1292,6 +1364,24 @@
           <w:sz w:val="24"/>
           <w:szCs w:val="24"/>
         </w:rPr>
+        <w:t xml:space="preserve"> accede a la </w:t>
+      </w:r>
+      <w:proofErr w:type="spellStart"/>
+      <w:r>
+        <w:rPr>
+          <w:rFonts w:ascii="Arial" w:hAnsi="Arial" w:cs="Arial"/>
+          <w:sz w:val="24"/>
+          <w:szCs w:val="24"/>
+        </w:rPr>
+        <w:t>Interfaz</w:t>
+      </w:r>
+      <w:proofErr w:type="spellEnd"/>
+      <w:r>
+        <w:rPr>
+          <w:rFonts w:ascii="Arial" w:hAnsi="Arial" w:cs="Arial"/>
+          <w:sz w:val="24"/>
+          <w:szCs w:val="24"/>
+        </w:rPr>
         <w:t xml:space="preserve"> </w:t>
       </w:r>
       <w:proofErr w:type="spellStart"/>
@@ -1301,7 +1391,7 @@
           <w:sz w:val="24"/>
           <w:szCs w:val="24"/>
         </w:rPr>
-        <w:t>selecciona</w:t>
+        <w:t>Verificar</w:t>
       </w:r>
       <w:proofErr w:type="spellEnd"/>
       <w:r>
@@ -1319,7 +1409,7 @@
           <w:sz w:val="24"/>
           <w:szCs w:val="24"/>
         </w:rPr>
-        <w:t>actualizar</w:t>
+        <w:t>Cliente</w:t>
       </w:r>
       <w:proofErr w:type="spellEnd"/>
       <w:r>
@@ -1328,7 +1418,7 @@
           <w:sz w:val="24"/>
           <w:szCs w:val="24"/>
         </w:rPr>
-        <w:t xml:space="preserve">. </w:t>
+        <w:t xml:space="preserve"> </w:t>
       </w:r>
     </w:p>
     <w:p>
@@ -1360,6 +1450,237 @@
           <w:sz w:val="24"/>
           <w:szCs w:val="24"/>
         </w:rPr>
+        <w:t>recepcionista</w:t>
+      </w:r>
+      <w:proofErr w:type="spellEnd"/>
+      <w:r>
+        <w:rPr>
+          <w:rFonts w:ascii="Arial" w:hAnsi="Arial" w:cs="Arial"/>
+          <w:sz w:val="24"/>
+          <w:szCs w:val="24"/>
+        </w:rPr>
+        <w:t xml:space="preserve"> </w:t>
+      </w:r>
+      <w:proofErr w:type="spellStart"/>
+      <w:r>
+        <w:rPr>
+          <w:rFonts w:ascii="Arial" w:hAnsi="Arial" w:cs="Arial"/>
+          <w:sz w:val="24"/>
+          <w:szCs w:val="24"/>
+        </w:rPr>
+        <w:t>verifica</w:t>
+      </w:r>
+      <w:proofErr w:type="spellEnd"/>
+      <w:r>
+        <w:rPr>
+          <w:rFonts w:ascii="Arial" w:hAnsi="Arial" w:cs="Arial"/>
+          <w:sz w:val="24"/>
+          <w:szCs w:val="24"/>
+        </w:rPr>
+        <w:t xml:space="preserve"> al </w:t>
+      </w:r>
+      <w:proofErr w:type="spellStart"/>
+      <w:r>
+        <w:rPr>
+          <w:rFonts w:ascii="Arial" w:hAnsi="Arial" w:cs="Arial"/>
+          <w:sz w:val="24"/>
+          <w:szCs w:val="24"/>
+        </w:rPr>
+        <w:t>cliente</w:t>
+      </w:r>
+      <w:proofErr w:type="spellEnd"/>
+      <w:r>
+        <w:rPr>
+          <w:rFonts w:ascii="Arial" w:hAnsi="Arial" w:cs="Arial"/>
+          <w:sz w:val="24"/>
+          <w:szCs w:val="24"/>
+        </w:rPr>
+        <w:t>.</w:t>
+      </w:r>
+    </w:p>
+    <w:p>
+      <w:pPr>
+        <w:widowControl/>
+        <w:numPr>
+          <w:ilvl w:val="0"/>
+          <w:numId w:val="41"/>
+        </w:numPr>
+        <w:spacing w:before="100" w:beforeAutospacing="1" w:after="100" w:afterAutospacing="1" w:line="240" w:lineRule="auto"/>
+        <w:rPr>
+          <w:rFonts w:ascii="Arial" w:hAnsi="Arial" w:cs="Arial"/>
+          <w:sz w:val="24"/>
+          <w:szCs w:val="24"/>
+        </w:rPr>
+      </w:pPr>
+      <w:r>
+        <w:rPr>
+          <w:rFonts w:ascii="Arial" w:hAnsi="Arial" w:cs="Arial"/>
+          <w:sz w:val="24"/>
+          <w:szCs w:val="24"/>
+        </w:rPr>
+        <w:t xml:space="preserve">El </w:t>
+      </w:r>
+      <w:proofErr w:type="spellStart"/>
+      <w:r>
+        <w:rPr>
+          <w:rFonts w:ascii="Arial" w:hAnsi="Arial" w:cs="Arial"/>
+          <w:sz w:val="24"/>
+          <w:szCs w:val="24"/>
+        </w:rPr>
+        <w:t>recepcionista</w:t>
+      </w:r>
+      <w:proofErr w:type="spellEnd"/>
+      <w:r>
+        <w:rPr>
+          <w:rFonts w:ascii="Arial" w:hAnsi="Arial" w:cs="Arial"/>
+          <w:sz w:val="24"/>
+          <w:szCs w:val="24"/>
+        </w:rPr>
+        <w:t xml:space="preserve"> </w:t>
+      </w:r>
+      <w:proofErr w:type="spellStart"/>
+      <w:r>
+        <w:rPr>
+          <w:rFonts w:ascii="Arial" w:hAnsi="Arial" w:cs="Arial"/>
+          <w:sz w:val="24"/>
+          <w:szCs w:val="24"/>
+        </w:rPr>
+        <w:t>modifica</w:t>
+      </w:r>
+      <w:proofErr w:type="spellEnd"/>
+      <w:r>
+        <w:rPr>
+          <w:rFonts w:ascii="Arial" w:hAnsi="Arial" w:cs="Arial"/>
+          <w:sz w:val="24"/>
+          <w:szCs w:val="24"/>
+        </w:rPr>
+        <w:t xml:space="preserve"> al </w:t>
+      </w:r>
+      <w:proofErr w:type="spellStart"/>
+      <w:r>
+        <w:rPr>
+          <w:rFonts w:ascii="Arial" w:hAnsi="Arial" w:cs="Arial"/>
+          <w:sz w:val="24"/>
+          <w:szCs w:val="24"/>
+        </w:rPr>
+        <w:t>cliente</w:t>
+      </w:r>
+      <w:proofErr w:type="spellEnd"/>
+      <w:r>
+        <w:rPr>
+          <w:rFonts w:ascii="Arial" w:hAnsi="Arial" w:cs="Arial"/>
+          <w:sz w:val="24"/>
+          <w:szCs w:val="24"/>
+        </w:rPr>
+        <w:t xml:space="preserve">. </w:t>
+      </w:r>
+    </w:p>
+    <w:p>
+      <w:pPr>
+        <w:widowControl/>
+        <w:numPr>
+          <w:ilvl w:val="0"/>
+          <w:numId w:val="41"/>
+        </w:numPr>
+        <w:spacing w:before="100" w:beforeAutospacing="1" w:after="100" w:afterAutospacing="1" w:line="240" w:lineRule="auto"/>
+        <w:rPr>
+          <w:rFonts w:ascii="Arial" w:hAnsi="Arial" w:cs="Arial"/>
+          <w:sz w:val="24"/>
+          <w:szCs w:val="24"/>
+        </w:rPr>
+      </w:pPr>
+      <w:r>
+        <w:rPr>
+          <w:rFonts w:ascii="Arial" w:hAnsi="Arial" w:cs="Arial"/>
+          <w:sz w:val="24"/>
+          <w:szCs w:val="24"/>
+        </w:rPr>
+        <w:t xml:space="preserve">El </w:t>
+      </w:r>
+      <w:proofErr w:type="spellStart"/>
+      <w:r>
+        <w:rPr>
+          <w:rFonts w:ascii="Arial" w:hAnsi="Arial" w:cs="Arial"/>
+          <w:sz w:val="24"/>
+          <w:szCs w:val="24"/>
+        </w:rPr>
+        <w:t>recepcionista</w:t>
+      </w:r>
+      <w:proofErr w:type="spellEnd"/>
+      <w:r>
+        <w:rPr>
+          <w:rFonts w:ascii="Arial" w:hAnsi="Arial" w:cs="Arial"/>
+          <w:sz w:val="24"/>
+          <w:szCs w:val="24"/>
+        </w:rPr>
+        <w:t xml:space="preserve"> </w:t>
+      </w:r>
+      <w:proofErr w:type="spellStart"/>
+      <w:r>
+        <w:rPr>
+          <w:rFonts w:ascii="Arial" w:hAnsi="Arial" w:cs="Arial"/>
+          <w:sz w:val="24"/>
+          <w:szCs w:val="24"/>
+        </w:rPr>
+        <w:t>selecciona</w:t>
+      </w:r>
+      <w:proofErr w:type="spellEnd"/>
+      <w:r>
+        <w:rPr>
+          <w:rFonts w:ascii="Arial" w:hAnsi="Arial" w:cs="Arial"/>
+          <w:sz w:val="24"/>
+          <w:szCs w:val="24"/>
+        </w:rPr>
+        <w:t xml:space="preserve"> </w:t>
+      </w:r>
+      <w:proofErr w:type="spellStart"/>
+      <w:r>
+        <w:rPr>
+          <w:rFonts w:ascii="Arial" w:hAnsi="Arial" w:cs="Arial"/>
+          <w:sz w:val="24"/>
+          <w:szCs w:val="24"/>
+        </w:rPr>
+        <w:t>actualizar</w:t>
+      </w:r>
+      <w:proofErr w:type="spellEnd"/>
+      <w:r>
+        <w:rPr>
+          <w:rFonts w:ascii="Arial" w:hAnsi="Arial" w:cs="Arial"/>
+          <w:sz w:val="24"/>
+          <w:szCs w:val="24"/>
+        </w:rPr>
+        <w:t xml:space="preserve">. </w:t>
+      </w:r>
+    </w:p>
+    <w:p>
+      <w:pPr>
+        <w:widowControl/>
+        <w:numPr>
+          <w:ilvl w:val="0"/>
+          <w:numId w:val="41"/>
+        </w:numPr>
+        <w:spacing w:before="100" w:beforeAutospacing="1" w:after="100" w:afterAutospacing="1" w:line="240" w:lineRule="auto"/>
+        <w:rPr>
+          <w:rFonts w:ascii="Arial" w:hAnsi="Arial" w:cs="Arial"/>
+          <w:sz w:val="24"/>
+          <w:szCs w:val="24"/>
+        </w:rPr>
+      </w:pPr>
+      <w:r>
+        <w:rPr>
+          <w:rFonts w:ascii="Arial" w:hAnsi="Arial" w:cs="Arial"/>
+          <w:sz w:val="24"/>
+          <w:szCs w:val="24"/>
+        </w:rPr>
+        <w:t xml:space="preserve">El </w:t>
+      </w:r>
+      <w:proofErr w:type="spellStart"/>
+      <w:r>
+        <w:rPr>
+          <w:rFonts w:ascii="Arial" w:hAnsi="Arial" w:cs="Arial"/>
+          <w:sz w:val="24"/>
+          <w:szCs w:val="24"/>
+        </w:rPr>
         <w:t>sistema</w:t>
       </w:r>
       <w:proofErr w:type="spellEnd"/>
@@ -2063,6 +2384,7 @@
           <w:sz w:val="24"/>
           <w:szCs w:val="24"/>
         </w:rPr>
+        <w:lastRenderedPageBreak/>
         <w:t xml:space="preserve">7. Puntos de </w:t>
       </w:r>
       <w:proofErr w:type="spellStart"/>
@@ -2124,7 +2446,6 @@
           <w:sz w:val="24"/>
           <w:szCs w:val="24"/>
         </w:rPr>
-        <w:lastRenderedPageBreak/>
         <w:t xml:space="preserve">8. </w:t>
       </w:r>
       <w:proofErr w:type="spellStart"/>

</xml_diff>